<commit_message>
feat: add prepared offline knowledge base
</commit_message>
<xml_diff>
--- a/deliverables/CMS-RAG_Nihai_Teknik_Dokumantasyon.docx
+++ b/deliverables/CMS-RAG_Nihai_Teknik_Dokumantasyon.docx
@@ -160,7 +160,7 @@
                 <w:color w:val="172033"/>
                 <w:sz w:val="17"/>
               </w:rPr>
-              <w:t>1.0</w:t>
+              <w:t>1.1</w:t>
             </w:r>
           </w:p>
         </w:tc>
@@ -208,7 +208,7 @@
                 <w:color w:val="172033"/>
                 <w:sz w:val="17"/>
               </w:rPr>
-              <w:t>26.07.2026</w:t>
+              <w:t>30.07.2026</w:t>
             </w:r>
           </w:p>
         </w:tc>
@@ -256,7 +256,7 @@
                 <w:color w:val="172033"/>
                 <w:sz w:val="17"/>
               </w:rPr>
-              <w:t>develop</w:t>
+              <w:t>codex/offline-knowledge-base</w:t>
             </w:r>
           </w:p>
         </w:tc>
@@ -281,7 +281,7 @@
                 <w:color w:val="172033"/>
                 <w:sz w:val="17"/>
               </w:rPr>
-              <w:t>Referans commit</w:t>
+              <w:t>Mimari</w:t>
             </w:r>
           </w:p>
         </w:tc>
@@ -304,7 +304,7 @@
                 <w:color w:val="172033"/>
                 <w:sz w:val="17"/>
               </w:rPr>
-              <w:t>d022506</w:t>
+              <w:t>Hazır PDF paketi + önceden hesaplanmış embedding snapshot'ı</w:t>
             </w:r>
           </w:p>
         </w:tc>
@@ -352,7 +352,7 @@
                 <w:color w:val="172033"/>
                 <w:sz w:val="17"/>
               </w:rPr>
-              <w:t>Nihai kabul — 33/33 test, 4/4 retrieval</w:t>
+              <w:t>Nihai kabul — 38/38 test, 8/8 retrieval</w:t>
             </w:r>
           </w:p>
         </w:tc>
@@ -397,7 +397,7 @@
                 <w:color w:val="172033"/>
                 <w:sz w:val="19"/>
               </w:rPr>
-              <w:t>Bu sistem tasnif dışı, kamuya açık veya kullanım yetkisi bulunan belgeler üzerinde bilgi keşfi içindir. Operasyonel karar sistemi değildir; kritik iddialar gösterilen asıl belge ve sayfadan doğrulanmalıdır.</w:t>
+              <w:t>Bu çalışma, HAVELSAN'ın deniz savaş yönetim sistemleri alanındaki kamuya açık çalışma ve ürünleri ile yapay zekâ entegrasyonu süreçlerine yönelik bir ön çalışma ve araştırmadır. Şirket içi, özel veya tasnifli veri kullanılmamıştır. Operasyonel karar sistemi değildir; kritik iddialar asıl belge ve sayfadan doğrulanmalıdır.</w:t>
             </w:r>
           </w:p>
         </w:tc>
@@ -642,7 +642,7 @@
                 <w:color w:val="172033"/>
                 <w:sz w:val="17"/>
               </w:rPr>
-              <w:t>Resmî ADVENT PDF'i, seçilmiş HAVELSAN içeriği ve NATO açık referansı</w:t>
+              <w:t>Dört önceden hazırlanmış kamuya açık PDF; şirket verisi kullanılmaz</w:t>
             </w:r>
           </w:p>
         </w:tc>
@@ -786,7 +786,7 @@
                 <w:color w:val="172033"/>
                 <w:sz w:val="17"/>
               </w:rPr>
-              <w:t>Temiz Git arşivinde 33/33 otomatik test ve 4/4 retrieval kabulü</w:t>
+              <w:t>38/38 otomatik test, 8/8 retrieval ve 75/75 snapshot doğrulaması</w:t>
             </w:r>
           </w:p>
         </w:tc>
@@ -960,7 +960,7 @@
     </w:p>
     <w:p>
       <w:r>
-        <w:t>Sistem, bulut tabanlı bir üretim servisine belge göndermek yerine Ollama üzerinde yerel model çalıştırır. Streamlit arayüzü; PDF yükleme, aynı içeriği tekrar engelleme, yeniden indeksleme, kapsam seçme, akışlı cevap ve her cevapla kalıcı kanıt kartı sunar.</w:t>
+        <w:t>Araştırma ve kaynak toplama normal kullanımdan önce tamamlanır. Dört metin çıkarılabilir PDF, 75 anlamlı parça ve bunların önceden hesaplanmış embeddingleri sürümlenmiş bir snapshot olarak hazırlanır. Streamlit açıldığında bu hazır paket yüklenir; çalışma anında web taraması veya çekirdek belgeleri yeniden embedding etme işlemi yapılmaz. Yerel Ollama yalnız getirilen kanıt üzerinden cevap üretir.</w:t>
       </w:r>
     </w:p>
     <w:tbl>
@@ -1105,7 +1105,7 @@
                 <w:color w:val="172033"/>
                 <w:sz w:val="17"/>
               </w:rPr>
-              <w:t>33 / 33</w:t>
+              <w:t>38 / 38</w:t>
             </w:r>
           </w:p>
         </w:tc>
@@ -1176,7 +1176,7 @@
                 <w:color w:val="172033"/>
                 <w:sz w:val="17"/>
               </w:rPr>
-              <w:t>4 / 4</w:t>
+              <w:t>8 / 8</w:t>
             </w:r>
           </w:p>
         </w:tc>
@@ -1199,7 +1199,7 @@
                 <w:color w:val="172033"/>
                 <w:sz w:val="17"/>
               </w:rPr>
-              <w:t>Resmî ve açık kaynak kapsamlarının doğru ayrımı</w:t>
+              <w:t>Hazır kamuya açık bilgi paketinde doğru kanıt erişimi</w:t>
             </w:r>
           </w:p>
         </w:tc>
@@ -1247,7 +1247,7 @@
                 <w:color w:val="172033"/>
                 <w:sz w:val="17"/>
               </w:rPr>
-              <w:t>59</w:t>
+              <w:t>75</w:t>
             </w:r>
           </w:p>
         </w:tc>
@@ -1270,7 +1270,7 @@
                 <w:color w:val="172033"/>
                 <w:sz w:val="17"/>
               </w:rPr>
-              <w:t>34 sayfalık resmî PDF + seçilmiş web referansları</w:t>
+              <w:t>Dört PDF ve önceden hesaplanmış 75 embedding</w:t>
             </w:r>
           </w:p>
         </w:tc>
@@ -1318,7 +1318,7 @@
                 <w:color w:val="172033"/>
                 <w:sz w:val="17"/>
               </w:rPr>
-              <w:t>34 / 34 sayfa</w:t>
+              <w:t>40 / 40 sayfa</w:t>
             </w:r>
           </w:p>
         </w:tc>
@@ -1341,7 +1341,7 @@
                 <w:color w:val="172033"/>
                 <w:sz w:val="17"/>
               </w:rPr>
-              <w:t>32.129 çıkarılmış metin karakteri</w:t>
+              <w:t>44.398 çıkarılmış metin karakteri</w:t>
             </w:r>
           </w:p>
         </w:tc>
@@ -1528,7 +1528,7 @@
                 <w:color w:val="172033"/>
                 <w:sz w:val="19"/>
               </w:rPr>
-              <w:t>Asistan yalnızca cevap üretmez; hangi belge, sayfa, otorite ve koleksiyonun cevabı desteklediğini de gösterir. Böylece kullanıcı model çıktısını denetleyebilir.</w:t>
+              <w:t>Asistan çalışma anında araştırma yapmaz. Önceden hazırlanıp doğrulanmış yerel bilgi paketinden kanıt getirir; belge ve sayfa bilgisini cevapla birlikte gösterir.</w:t>
             </w:r>
           </w:p>
         </w:tc>
@@ -2125,7 +2125,7 @@
                 <w:color w:val="172033"/>
                 <w:sz w:val="17"/>
               </w:rPr>
-              <w:t>Temiz kopyada aynı sonuç</w:t>
+              <w:t>Hazır paket ve snapshot</w:t>
             </w:r>
           </w:p>
         </w:tc>
@@ -2148,7 +2148,7 @@
                 <w:color w:val="172033"/>
                 <w:sz w:val="17"/>
               </w:rPr>
-              <w:t>33/33 ve 4/4</w:t>
+              <w:t>38/38, 8/8 ve 75/75</w:t>
             </w:r>
           </w:p>
         </w:tc>
@@ -2184,7 +2184,7 @@
         <w:pStyle w:val="ListBullet"/>
       </w:pPr>
       <w:r>
-        <w:t>ADVENT ve CMS kavramları hakkında doküman destekli soru-cevap.</w:t>
+        <w:t>ADVENT ve CMS kavramları hakkında hazır doküman paketinden kaynaklı soru-cevap.</w:t>
       </w:r>
     </w:p>
     <w:p>
@@ -2192,7 +2192,7 @@
         <w:pStyle w:val="ListBullet"/>
       </w:pPr>
       <w:r>
-        <w:t>Resmî PDF yükleme, doğrulama, içerik hash'i ve indeksleme.</w:t>
+        <w:t>Kamuya açık kaynakların ön araştırması, kürasyonu ve PDF paketine dönüştürülmesi.</w:t>
       </w:r>
     </w:p>
     <w:p>
@@ -2200,7 +2200,23 @@
         <w:pStyle w:val="ListBullet"/>
       </w:pPr>
       <w:r>
-        <w:t>HAVELSAN resmî seçilmiş içeriği ile NATO açık referansının ayrı tutulması.</w:t>
+        <w:t>Chunk ve embedding snapshot'ının normal kullanımdan önce hazırlanması.</w:t>
+      </w:r>
+    </w:p>
+    <w:p>
+      <w:pPr>
+        <w:pStyle w:val="ListBullet"/>
+      </w:pPr>
+      <w:r>
+        <w:t>İsteğe bağlı ek PDF yükleme, doğrulama, içerik hash'i ve indeksleme.</w:t>
+      </w:r>
+    </w:p>
+    <w:p>
+      <w:pPr>
+        <w:pStyle w:val="ListBullet"/>
+      </w:pPr>
+      <w:r>
+        <w:t>HAVELSAN resmî içeriği ile NATO/açık kamu referanslarının kaynak kimliğiyle korunması.</w:t>
       </w:r>
     </w:p>
     <w:p>
@@ -2248,7 +2264,7 @@
         <w:pStyle w:val="ListBullet"/>
       </w:pPr>
       <w:r>
-        <w:t>Tasnifli/veri sahibi izni bulunmayan içeriğin işlenmesi.</w:t>
+        <w:t>HAVELSAN şirket içi, özel, tasnifli veya veri sahibi izni bulunmayan içerik.</w:t>
       </w:r>
     </w:p>
     <w:p>
@@ -2256,7 +2272,7 @@
         <w:pStyle w:val="ListBullet"/>
       </w:pPr>
       <w:r>
-        <w:t>Rastgele ve kontrolsüz internet taraması.</w:t>
+        <w:t>Normal soru-cevap sırasında internet araştırması veya web taraması.</w:t>
       </w:r>
     </w:p>
     <w:p>
@@ -2925,7 +2941,7 @@
                 <w:color w:val="172033"/>
                 <w:sz w:val="17"/>
               </w:rPr>
-              <w:t>Yüklenen resmî PDF + HAVELSAN seçilmiş içerik</w:t>
+              <w:t>Hazır ADVENT broşürü + HAVELSAN kamu içeriği</w:t>
             </w:r>
           </w:p>
         </w:tc>
@@ -3019,7 +3035,7 @@
                 <w:color w:val="172033"/>
                 <w:sz w:val="17"/>
               </w:rPr>
-              <w:t>NATO gibi kamuya açık referanslar</w:t>
+              <w:t>NATO ve diğer kamuya açık birincil referanslar</w:t>
             </w:r>
           </w:p>
         </w:tc>
@@ -3065,7 +3081,7 @@
                 <w:color w:val="172033"/>
                 <w:sz w:val="17"/>
               </w:rPr>
-              <w:t>Genel C2, veri ve birlikte çalışabilirlik</w:t>
+              <w:t>Genel C2, veri ve sorumlu yapay zekâ</w:t>
             </w:r>
           </w:p>
         </w:tc>
@@ -8810,7 +8826,7 @@
                 <w:color w:val="172033"/>
                 <w:sz w:val="17"/>
               </w:rPr>
-              <w:t>33/33</w:t>
+              <w:t>38/38</w:t>
             </w:r>
           </w:p>
         </w:tc>
@@ -8858,7 +8874,7 @@
                 <w:color w:val="172033"/>
                 <w:sz w:val="17"/>
               </w:rPr>
-              <w:t>4/4</w:t>
+              <w:t>8/8</w:t>
             </w:r>
           </w:p>
         </w:tc>
@@ -8906,7 +8922,7 @@
                 <w:color w:val="172033"/>
                 <w:sz w:val="17"/>
               </w:rPr>
-              <w:t>59</w:t>
+              <w:t>75</w:t>
             </w:r>
           </w:p>
         </w:tc>
@@ -8954,7 +8970,7 @@
                 <w:color w:val="172033"/>
                 <w:sz w:val="17"/>
               </w:rPr>
-              <w:t>34/34 metinli</w:t>
+              <w:t>40/40 metinli</w:t>
             </w:r>
           </w:p>
         </w:tc>
@@ -10098,7 +10114,7 @@
     </w:p>
     <w:p>
       <w:r>
-        <w:t>Bu dokümantasyonun referans aldığı doğrulanmış entegrasyon commit'i d022506'dır. Eski main geçmişi silinmemiş; modüler mimari feature dalından develop'a merge commit ile alınmıştır.</w:t>
+        <w:t>Bu dokümantasyonun referans aldığı doğrulanmış entegrasyon commit'i codex/offline-knowledge-base'dır. Eski main geçmişi silinmemiş; modüler mimari feature dalından develop'a merge commit ile alınmıştır.</w:t>
       </w:r>
     </w:p>
     <w:p>
@@ -11958,7 +11974,7 @@
                 <w:color w:val="172033"/>
                 <w:sz w:val="17"/>
               </w:rPr>
-              <w:t>33/33, 4/4 ve temiz Git arşivi</w:t>
+              <w:t>38/38, 8/8 ve 75/75 snapshot</w:t>
             </w:r>
           </w:p>
         </w:tc>

</xml_diff>

<commit_message>
fix: align evidence retrieval and answer decisions
</commit_message>
<xml_diff>
--- a/deliverables/CMS-RAG_Nihai_Teknik_Dokumantasyon.docx
+++ b/deliverables/CMS-RAG_Nihai_Teknik_Dokumantasyon.docx
@@ -352,7 +352,7 @@
                 <w:color w:val="172033"/>
                 <w:sz w:val="17"/>
               </w:rPr>
-              <w:t>Nihai kabul — 38/38 test, 8/8 retrieval</w:t>
+              <w:t>Nihai kabul — 41/41 test, 8/8 retrieval, 7/7 yanıt</w:t>
             </w:r>
           </w:p>
         </w:tc>
@@ -786,7 +786,7 @@
                 <w:color w:val="172033"/>
                 <w:sz w:val="17"/>
               </w:rPr>
-              <w:t>38/38 otomatik test, 8/8 retrieval ve 75/75 snapshot doğrulaması</w:t>
+              <w:t>41/41 test, 8/8 retrieval, 7/7 yanıt ve 67/67 snapshot</w:t>
             </w:r>
           </w:p>
         </w:tc>
@@ -960,7 +960,7 @@
     </w:p>
     <w:p>
       <w:r>
-        <w:t>Araştırma ve kaynak toplama normal kullanımdan önce tamamlanır. Dört metin çıkarılabilir PDF, 75 anlamlı parça ve bunların önceden hesaplanmış embeddingleri sürümlenmiş bir snapshot olarak hazırlanır. Streamlit açıldığında bu hazır paket yüklenir; çalışma anında web taraması veya çekirdek belgeleri yeniden embedding etme işlemi yapılmaz. Yerel Ollama yalnız getirilen kanıt üzerinden cevap üretir.</w:t>
+        <w:t>Araştırma ve kaynak toplama normal kullanımdan önce tamamlanır. Dört metin çıkarılabilir PDF, 67 anlamlı parça ve bunların önceden hesaplanmış embeddingleri sürümlenmiş bir snapshot olarak hazırlanır. Streamlit açıldığında bu hazır paket yüklenir; çalışma anında web taraması veya çekirdek belgeleri yeniden embedding etme işlemi yapılmaz. Yerel Ollama yalnız getirilen kanıt üzerinden cevap üretir.</w:t>
       </w:r>
     </w:p>
     <w:tbl>
@@ -1105,7 +1105,7 @@
                 <w:color w:val="172033"/>
                 <w:sz w:val="17"/>
               </w:rPr>
-              <w:t>38 / 38</w:t>
+              <w:t>41 / 41</w:t>
             </w:r>
           </w:p>
         </w:tc>
@@ -1224,7 +1224,7 @@
                 <w:color w:val="172033"/>
                 <w:sz w:val="17"/>
               </w:rPr>
-              <w:t>İndekslenen kanıt</w:t>
+              <w:t>Yanıt kabulü</w:t>
             </w:r>
           </w:p>
         </w:tc>
@@ -1247,7 +1247,7 @@
                 <w:color w:val="172033"/>
                 <w:sz w:val="17"/>
               </w:rPr>
-              <w:t>75</w:t>
+              <w:t>7 / 7</w:t>
             </w:r>
           </w:p>
         </w:tc>
@@ -1270,7 +1270,7 @@
                 <w:color w:val="172033"/>
                 <w:sz w:val="17"/>
               </w:rPr>
-              <w:t>Dört PDF ve önceden hesaplanmış 75 embedding</w:t>
+              <w:t>Kavram, atıf, kaynak ve doğru ret kararı</w:t>
             </w:r>
           </w:p>
         </w:tc>
@@ -1295,7 +1295,7 @@
                 <w:color w:val="172033"/>
                 <w:sz w:val="17"/>
               </w:rPr>
-              <w:t>PDF bütünlüğü</w:t>
+              <w:t>İndekslenen kanıt</w:t>
             </w:r>
           </w:p>
         </w:tc>
@@ -1318,7 +1318,7 @@
                 <w:color w:val="172033"/>
                 <w:sz w:val="17"/>
               </w:rPr>
-              <w:t>40 / 40 sayfa</w:t>
+              <w:t>67</w:t>
             </w:r>
           </w:p>
         </w:tc>
@@ -1341,7 +1341,7 @@
                 <w:color w:val="172033"/>
                 <w:sz w:val="17"/>
               </w:rPr>
-              <w:t>44.398 çıkarılmış metin karakteri</w:t>
+              <w:t>Dört PDF ve önceden hesaplanmış 67 embedding</w:t>
             </w:r>
           </w:p>
         </w:tc>
@@ -1366,7 +1366,7 @@
                 <w:color w:val="172033"/>
                 <w:sz w:val="17"/>
               </w:rPr>
-              <w:t>Canlı servis</w:t>
+              <w:t>PDF bütünlüğü</w:t>
             </w:r>
           </w:p>
         </w:tc>
@@ -1389,7 +1389,7 @@
                 <w:color w:val="172033"/>
                 <w:sz w:val="17"/>
               </w:rPr>
-              <w:t>HTTP 200</w:t>
+              <w:t>40 / 40 sayfa</w:t>
             </w:r>
           </w:p>
         </w:tc>
@@ -1412,7 +1412,7 @@
                 <w:color w:val="172033"/>
                 <w:sz w:val="17"/>
               </w:rPr>
-              <w:t>Ana sayfa ve health endpoint</w:t>
+              <w:t>44.398 çıkarılmış metin karakteri</w:t>
             </w:r>
           </w:p>
         </w:tc>
@@ -1437,7 +1437,7 @@
                 <w:color w:val="172033"/>
                 <w:sz w:val="17"/>
               </w:rPr>
-              <w:t>Git yeniden üretim</w:t>
+              <w:t>Canlı servis</w:t>
             </w:r>
           </w:p>
         </w:tc>
@@ -1460,7 +1460,7 @@
                 <w:color w:val="172033"/>
                 <w:sz w:val="17"/>
               </w:rPr>
-              <w:t>Başarılı</w:t>
+              <w:t>HTTP 200</w:t>
             </w:r>
           </w:p>
         </w:tc>
@@ -1468,6 +1468,77 @@
           <w:tcPr>
             <w:tcW w:type="dxa" w:w="4706"/>
             <w:shd w:fill="F3F6FA"/>
+            <w:tcBorders>
+              <w:top w:val="single" w:sz="6" w:color="D7E0EA"/>
+              <w:left w:val="single" w:sz="6" w:color="D7E0EA"/>
+              <w:bottom w:val="single" w:sz="6" w:color="D7E0EA"/>
+              <w:right w:val="single" w:sz="6" w:color="D7E0EA"/>
+            </w:tcBorders>
+            <w:vAlign w:val="center"/>
+          </w:tcPr>
+          <w:p>
+            <w:r>
+              <w:rPr>
+                <w:rFonts w:ascii="Aptos" w:hAnsi="Aptos"/>
+                <w:color w:val="172033"/>
+                <w:sz w:val="17"/>
+              </w:rPr>
+              <w:t>Ana sayfa ve health endpoint</w:t>
+            </w:r>
+          </w:p>
+        </w:tc>
+      </w:tr>
+      <w:tr>
+        <w:tc>
+          <w:tcPr>
+            <w:tcW w:type="dxa" w:w="2948"/>
+            <w:shd w:fill="FFFFFF"/>
+            <w:tcBorders>
+              <w:top w:val="single" w:sz="6" w:color="D7E0EA"/>
+              <w:left w:val="single" w:sz="6" w:color="D7E0EA"/>
+              <w:bottom w:val="single" w:sz="6" w:color="D7E0EA"/>
+              <w:right w:val="single" w:sz="6" w:color="D7E0EA"/>
+            </w:tcBorders>
+            <w:vAlign w:val="center"/>
+          </w:tcPr>
+          <w:p>
+            <w:r>
+              <w:rPr>
+                <w:rFonts w:ascii="Aptos" w:hAnsi="Aptos"/>
+                <w:color w:val="172033"/>
+                <w:sz w:val="17"/>
+              </w:rPr>
+              <w:t>Git yeniden üretim</w:t>
+            </w:r>
+          </w:p>
+        </w:tc>
+        <w:tc>
+          <w:tcPr>
+            <w:tcW w:type="dxa" w:w="1701"/>
+            <w:shd w:fill="FFFFFF"/>
+            <w:tcBorders>
+              <w:top w:val="single" w:sz="6" w:color="D7E0EA"/>
+              <w:left w:val="single" w:sz="6" w:color="D7E0EA"/>
+              <w:bottom w:val="single" w:sz="6" w:color="D7E0EA"/>
+              <w:right w:val="single" w:sz="6" w:color="D7E0EA"/>
+            </w:tcBorders>
+            <w:vAlign w:val="center"/>
+          </w:tcPr>
+          <w:p>
+            <w:r>
+              <w:rPr>
+                <w:rFonts w:ascii="Aptos" w:hAnsi="Aptos"/>
+                <w:color w:val="172033"/>
+                <w:sz w:val="17"/>
+              </w:rPr>
+              <w:t>Başarılı</w:t>
+            </w:r>
+          </w:p>
+        </w:tc>
+        <w:tc>
+          <w:tcPr>
+            <w:tcW w:type="dxa" w:w="4706"/>
+            <w:shd w:fill="FFFFFF"/>
             <w:tcBorders>
               <w:top w:val="single" w:sz="6" w:color="D7E0EA"/>
               <w:left w:val="single" w:sz="6" w:color="D7E0EA"/>
@@ -2148,7 +2219,7 @@
                 <w:color w:val="172033"/>
                 <w:sz w:val="17"/>
               </w:rPr>
-              <w:t>38/38, 8/8 ve 75/75</w:t>
+              <w:t>41/41, 8/8, 7/7 ve 67/67</w:t>
             </w:r>
           </w:p>
         </w:tc>
@@ -8826,7 +8897,7 @@
                 <w:color w:val="172033"/>
                 <w:sz w:val="17"/>
               </w:rPr>
-              <w:t>38/38</w:t>
+              <w:t>41/41</w:t>
             </w:r>
           </w:p>
         </w:tc>
@@ -8899,7 +8970,7 @@
                 <w:color w:val="172033"/>
                 <w:sz w:val="17"/>
               </w:rPr>
-              <w:t>İndekslenen parça</w:t>
+              <w:t>Yanıt kabulü</w:t>
             </w:r>
           </w:p>
         </w:tc>
@@ -8922,7 +8993,7 @@
                 <w:color w:val="172033"/>
                 <w:sz w:val="17"/>
               </w:rPr>
-              <w:t>75</w:t>
+              <w:t>7/7</w:t>
             </w:r>
           </w:p>
         </w:tc>
@@ -8947,7 +9018,7 @@
                 <w:color w:val="172033"/>
                 <w:sz w:val="17"/>
               </w:rPr>
-              <w:t>PDF sayfası</w:t>
+              <w:t>İndekslenen parça</w:t>
             </w:r>
           </w:p>
         </w:tc>
@@ -8970,7 +9041,7 @@
                 <w:color w:val="172033"/>
                 <w:sz w:val="17"/>
               </w:rPr>
-              <w:t>40/40 metinli</w:t>
+              <w:t>67</w:t>
             </w:r>
           </w:p>
         </w:tc>
@@ -8995,7 +9066,7 @@
                 <w:color w:val="172033"/>
                 <w:sz w:val="17"/>
               </w:rPr>
-              <w:t>Boş parça / eksik kaynak yolu</w:t>
+              <w:t>PDF sayfası</w:t>
             </w:r>
           </w:p>
         </w:tc>
@@ -9018,7 +9089,7 @@
                 <w:color w:val="172033"/>
                 <w:sz w:val="17"/>
               </w:rPr>
-              <w:t>0 / 0</w:t>
+              <w:t>40/40 metinli</w:t>
             </w:r>
           </w:p>
         </w:tc>
@@ -9043,7 +9114,7 @@
                 <w:color w:val="172033"/>
                 <w:sz w:val="17"/>
               </w:rPr>
-              <w:t>Canlı Streamlit</w:t>
+              <w:t>Boş parça / eksik kaynak yolu</w:t>
             </w:r>
           </w:p>
         </w:tc>
@@ -9066,7 +9137,7 @@
                 <w:color w:val="172033"/>
                 <w:sz w:val="17"/>
               </w:rPr>
-              <w:t>HTTP 200</w:t>
+              <w:t>0 / 0</w:t>
             </w:r>
           </w:p>
         </w:tc>
@@ -9091,7 +9162,7 @@
                 <w:color w:val="172033"/>
                 <w:sz w:val="17"/>
               </w:rPr>
-              <w:t>Temiz Git arşivi</w:t>
+              <w:t>Canlı Streamlit</w:t>
             </w:r>
           </w:p>
         </w:tc>
@@ -9099,6 +9170,54 @@
           <w:tcPr>
             <w:tcW w:type="dxa" w:w="4876"/>
             <w:shd w:fill="FFFFFF"/>
+            <w:tcBorders>
+              <w:top w:val="single" w:sz="6" w:color="D7E0EA"/>
+              <w:left w:val="single" w:sz="6" w:color="D7E0EA"/>
+              <w:bottom w:val="single" w:sz="6" w:color="D7E0EA"/>
+              <w:right w:val="single" w:sz="6" w:color="D7E0EA"/>
+            </w:tcBorders>
+            <w:vAlign w:val="center"/>
+          </w:tcPr>
+          <w:p>
+            <w:r>
+              <w:rPr>
+                <w:rFonts w:ascii="Aptos" w:hAnsi="Aptos"/>
+                <w:color w:val="172033"/>
+                <w:sz w:val="17"/>
+              </w:rPr>
+              <w:t>HTTP 200</w:t>
+            </w:r>
+          </w:p>
+        </w:tc>
+      </w:tr>
+      <w:tr>
+        <w:tc>
+          <w:tcPr>
+            <w:tcW w:type="dxa" w:w="4535"/>
+            <w:shd w:fill="F3F6FA"/>
+            <w:tcBorders>
+              <w:top w:val="single" w:sz="6" w:color="D7E0EA"/>
+              <w:left w:val="single" w:sz="6" w:color="D7E0EA"/>
+              <w:bottom w:val="single" w:sz="6" w:color="D7E0EA"/>
+              <w:right w:val="single" w:sz="6" w:color="D7E0EA"/>
+            </w:tcBorders>
+            <w:vAlign w:val="center"/>
+          </w:tcPr>
+          <w:p>
+            <w:r>
+              <w:rPr>
+                <w:rFonts w:ascii="Aptos" w:hAnsi="Aptos"/>
+                <w:color w:val="172033"/>
+                <w:sz w:val="17"/>
+              </w:rPr>
+              <w:t>Temiz Git arşivi</w:t>
+            </w:r>
+          </w:p>
+        </w:tc>
+        <w:tc>
+          <w:tcPr>
+            <w:tcW w:type="dxa" w:w="4876"/>
+            <w:shd w:fill="F3F6FA"/>
             <w:tcBorders>
               <w:top w:val="single" w:sz="6" w:color="D7E0EA"/>
               <w:left w:val="single" w:sz="6" w:color="D7E0EA"/>
@@ -11974,7 +12093,7 @@
                 <w:color w:val="172033"/>
                 <w:sz w:val="17"/>
               </w:rPr>
-              <w:t>38/38, 8/8 ve 75/75 snapshot</w:t>
+              <w:t>41/41, 8/8, 7/7 ve 67/67 snapshot</w:t>
             </w:r>
           </w:p>
         </w:tc>

</xml_diff>

<commit_message>
feat: expand evaluation and add privacy-safe audit
</commit_message>
<xml_diff>
--- a/deliverables/CMS-RAG_Nihai_Teknik_Dokumantasyon.docx
+++ b/deliverables/CMS-RAG_Nihai_Teknik_Dokumantasyon.docx
@@ -160,7 +160,7 @@
                 <w:color w:val="172033"/>
                 <w:sz w:val="17"/>
               </w:rPr>
-              <w:t>1.1</w:t>
+              <w:t>1.2</w:t>
             </w:r>
           </w:p>
         </w:tc>
@@ -208,7 +208,7 @@
                 <w:color w:val="172033"/>
                 <w:sz w:val="17"/>
               </w:rPr>
-              <w:t>30.07.2026</w:t>
+              <w:t>02.08.2026</w:t>
             </w:r>
           </w:p>
         </w:tc>
@@ -256,7 +256,7 @@
                 <w:color w:val="172033"/>
                 <w:sz w:val="17"/>
               </w:rPr>
-              <w:t>codex/offline-knowledge-base</w:t>
+              <w:t>codex/evaluation-benchmark</w:t>
             </w:r>
           </w:p>
         </w:tc>
@@ -6236,7 +6236,7 @@
                 <w:color w:val="172033"/>
                 <w:sz w:val="17"/>
               </w:rPr>
-              <w:t>96</w:t>
+              <w:t>160 + gerekirse 96</w:t>
             </w:r>
           </w:p>
         </w:tc>
@@ -6259,7 +6259,7 @@
                 <w:color w:val="172033"/>
                 <w:sz w:val="17"/>
               </w:rPr>
-              <w:t>Kısa ve kontrollü çıktı</w:t>
+              <w:t>Kesik cümleyi tek kontrollü devamla tamamlama</w:t>
             </w:r>
           </w:p>
         </w:tc>
@@ -6482,6 +6482,22 @@
     </w:p>
     <w:p>
       <w:pPr>
+        <w:pStyle w:val="ListBullet"/>
+      </w:pPr>
+      <w:r>
+        <w:t>Yerel audit ham soru/cevap saklamaz; sorgu SHA-256 özeti ve işletim metadatası tutulur.</w:t>
+      </w:r>
+    </w:p>
+    <w:p>
+      <w:pPr>
+        <w:pStyle w:val="ListBullet"/>
+      </w:pPr>
+      <w:r>
+        <w:t>PDF önizlemesi yalnız proje data dizini altındaki doğrulanmış dosyalara erişir.</w:t>
+      </w:r>
+    </w:p>
+    <w:p>
+      <w:pPr>
         <w:pStyle w:val="Heading2"/>
       </w:pPr>
       <w:r>
@@ -7190,7 +7206,7 @@
                 <w:color w:val="172033"/>
                 <w:sz w:val="17"/>
               </w:rPr>
-              <w:t>Kapsam seçimi, PDF yükleme, indeks yenileme, oturum temizleme</w:t>
+              <w:t>Asistan/değerlendirme görünümü, kapsam, PDF, indeks ve oturum işlemleri</w:t>
             </w:r>
           </w:p>
         </w:tc>
@@ -7430,7 +7446,7 @@
                 <w:color w:val="172033"/>
                 <w:sz w:val="17"/>
               </w:rPr>
-              <w:t>Belge, sayfa, otorite, alıntı ve varsa kaynak URL'si</w:t>
+              <w:t>Belge, sayfa, otorite, alıntı, URL ve gerçek PDF sayfa önizlemesi</w:t>
             </w:r>
           </w:p>
         </w:tc>
@@ -7455,7 +7471,7 @@
                 <w:color w:val="172033"/>
                 <w:sz w:val="17"/>
               </w:rPr>
-              <w:t>Belge yönetimi</w:t>
+              <w:t>Değerlendirme</w:t>
             </w:r>
           </w:p>
         </w:tc>
@@ -7463,6 +7479,54 @@
           <w:tcPr>
             <w:tcW w:type="dxa" w:w="7030"/>
             <w:shd w:fill="FFFFFF"/>
+            <w:tcBorders>
+              <w:top w:val="single" w:sz="6" w:color="D7E0EA"/>
+              <w:left w:val="single" w:sz="6" w:color="D7E0EA"/>
+              <w:bottom w:val="single" w:sz="6" w:color="D7E0EA"/>
+              <w:right w:val="single" w:sz="6" w:color="D7E0EA"/>
+            </w:tcBorders>
+            <w:vAlign w:val="center"/>
+          </w:tcPr>
+          <w:p>
+            <w:r>
+              <w:rPr>
+                <w:rFonts w:ascii="Aptos" w:hAnsi="Aptos"/>
+                <w:color w:val="172033"/>
+                <w:sz w:val="17"/>
+              </w:rPr>
+              <w:t>45-vaka benchmark, 30-vaka hakem, chunk, backend ve audit görünümü</w:t>
+            </w:r>
+          </w:p>
+        </w:tc>
+      </w:tr>
+      <w:tr>
+        <w:tc>
+          <w:tcPr>
+            <w:tcW w:type="dxa" w:w="2381"/>
+            <w:shd w:fill="F3F6FA"/>
+            <w:tcBorders>
+              <w:top w:val="single" w:sz="6" w:color="D7E0EA"/>
+              <w:left w:val="single" w:sz="6" w:color="D7E0EA"/>
+              <w:bottom w:val="single" w:sz="6" w:color="D7E0EA"/>
+              <w:right w:val="single" w:sz="6" w:color="D7E0EA"/>
+            </w:tcBorders>
+            <w:vAlign w:val="center"/>
+          </w:tcPr>
+          <w:p>
+            <w:r>
+              <w:rPr>
+                <w:rFonts w:ascii="Aptos" w:hAnsi="Aptos"/>
+                <w:color w:val="172033"/>
+                <w:sz w:val="17"/>
+              </w:rPr>
+              <w:t>Belge yönetimi</w:t>
+            </w:r>
+          </w:p>
+        </w:tc>
+        <w:tc>
+          <w:tcPr>
+            <w:tcW w:type="dxa" w:w="7030"/>
+            <w:shd w:fill="F3F6FA"/>
             <w:tcBorders>
               <w:top w:val="single" w:sz="6" w:color="D7E0EA"/>
               <w:left w:val="single" w:sz="6" w:color="D7E0EA"/>
@@ -8684,7 +8748,7 @@
                 <w:color w:val="172033"/>
                 <w:sz w:val="17"/>
               </w:rPr>
-              <w:t>Retrieval</w:t>
+              <w:t>Audit</w:t>
             </w:r>
           </w:p>
         </w:tc>
@@ -8707,7 +8771,7 @@
                 <w:color w:val="172033"/>
                 <w:sz w:val="17"/>
               </w:rPr>
-              <w:t>4 sabit koleksiyon/terim/sayfa kabul vakası</w:t>
+              <w:t>Ham içeriksiz SHA-256 özeti, gecikme, kapsam ve kaynak metadatası</w:t>
             </w:r>
           </w:p>
         </w:tc>
@@ -8730,7 +8794,78 @@
                 <w:color w:val="172033"/>
                 <w:sz w:val="17"/>
               </w:rPr>
-              <w:t>4 / 4</w:t>
+              <w:t>Başarılı</w:t>
+            </w:r>
+          </w:p>
+        </w:tc>
+      </w:tr>
+      <w:tr>
+        <w:tc>
+          <w:tcPr>
+            <w:tcW w:type="dxa" w:w="2268"/>
+            <w:shd w:fill="FFFFFF"/>
+            <w:tcBorders>
+              <w:top w:val="single" w:sz="6" w:color="D7E0EA"/>
+              <w:left w:val="single" w:sz="6" w:color="D7E0EA"/>
+              <w:bottom w:val="single" w:sz="6" w:color="D7E0EA"/>
+              <w:right w:val="single" w:sz="6" w:color="D7E0EA"/>
+            </w:tcBorders>
+            <w:vAlign w:val="center"/>
+          </w:tcPr>
+          <w:p>
+            <w:r>
+              <w:rPr>
+                <w:rFonts w:ascii="Aptos" w:hAnsi="Aptos"/>
+                <w:color w:val="172033"/>
+                <w:sz w:val="17"/>
+              </w:rPr>
+              <w:t>Retrieval</w:t>
+            </w:r>
+          </w:p>
+        </w:tc>
+        <w:tc>
+          <w:tcPr>
+            <w:tcW w:type="dxa" w:w="5499"/>
+            <w:shd w:fill="FFFFFF"/>
+            <w:tcBorders>
+              <w:top w:val="single" w:sz="6" w:color="D7E0EA"/>
+              <w:left w:val="single" w:sz="6" w:color="D7E0EA"/>
+              <w:bottom w:val="single" w:sz="6" w:color="D7E0EA"/>
+              <w:right w:val="single" w:sz="6" w:color="D7E0EA"/>
+            </w:tcBorders>
+            <w:vAlign w:val="center"/>
+          </w:tcPr>
+          <w:p>
+            <w:r>
+              <w:rPr>
+                <w:rFonts w:ascii="Aptos" w:hAnsi="Aptos"/>
+                <w:color w:val="172033"/>
+                <w:sz w:val="17"/>
+              </w:rPr>
+              <w:t>45 altın belge/terim/sayfa ve güvenli-ret vakası</w:t>
+            </w:r>
+          </w:p>
+        </w:tc>
+        <w:tc>
+          <w:tcPr>
+            <w:tcW w:type="dxa" w:w="1644"/>
+            <w:shd w:fill="FFFFFF"/>
+            <w:tcBorders>
+              <w:top w:val="single" w:sz="6" w:color="D7E0EA"/>
+              <w:left w:val="single" w:sz="6" w:color="D7E0EA"/>
+              <w:bottom w:val="single" w:sz="6" w:color="D7E0EA"/>
+              <w:right w:val="single" w:sz="6" w:color="D7E0EA"/>
+            </w:tcBorders>
+            <w:vAlign w:val="center"/>
+          </w:tcPr>
+          <w:p>
+            <w:r>
+              <w:rPr>
+                <w:rFonts w:ascii="Aptos" w:hAnsi="Aptos"/>
+                <w:color w:val="172033"/>
+                <w:sz w:val="17"/>
+              </w:rPr>
+              <w:t>45 / 45</w:t>
             </w:r>
           </w:p>
         </w:tc>
@@ -8897,7 +9032,7 @@
                 <w:color w:val="172033"/>
                 <w:sz w:val="17"/>
               </w:rPr>
-              <w:t>41/41</w:t>
+              <w:t>69/69</w:t>
             </w:r>
           </w:p>
         </w:tc>
@@ -8922,7 +9057,7 @@
                 <w:color w:val="172033"/>
                 <w:sz w:val="17"/>
               </w:rPr>
-              <w:t>Retrieval kabulü</w:t>
+              <w:t>Altın benchmark</w:t>
             </w:r>
           </w:p>
         </w:tc>
@@ -8945,7 +9080,7 @@
                 <w:color w:val="172033"/>
                 <w:sz w:val="17"/>
               </w:rPr>
-              <w:t>8/8</w:t>
+              <w:t>45/45</w:t>
             </w:r>
           </w:p>
         </w:tc>
@@ -8970,7 +9105,7 @@
                 <w:color w:val="172033"/>
                 <w:sz w:val="17"/>
               </w:rPr>
-              <w:t>Yanıt kabulü</w:t>
+              <w:t>TP / TN / FP / FN</w:t>
             </w:r>
           </w:p>
         </w:tc>
@@ -8993,7 +9128,7 @@
                 <w:color w:val="172033"/>
                 <w:sz w:val="17"/>
               </w:rPr>
-              <w:t>7/7</w:t>
+              <w:t>30 / 15 / 0 / 0</w:t>
             </w:r>
           </w:p>
         </w:tc>
@@ -9018,7 +9153,7 @@
                 <w:color w:val="172033"/>
                 <w:sz w:val="17"/>
               </w:rPr>
-              <w:t>İndekslenen parça</w:t>
+              <w:t>Bağımsız cevap hakemi</w:t>
             </w:r>
           </w:p>
         </w:tc>
@@ -9041,7 +9176,7 @@
                 <w:color w:val="172033"/>
                 <w:sz w:val="17"/>
               </w:rPr>
-              <w:t>67</w:t>
+              <w:t>30/30 katı başarı</w:t>
             </w:r>
           </w:p>
         </w:tc>
@@ -9066,7 +9201,7 @@
                 <w:color w:val="172033"/>
                 <w:sz w:val="17"/>
               </w:rPr>
-              <w:t>PDF sayfası</w:t>
+              <w:t>Chunk hakemi</w:t>
             </w:r>
           </w:p>
         </w:tc>
@@ -9089,7 +9224,7 @@
                 <w:color w:val="172033"/>
                 <w:sz w:val="17"/>
               </w:rPr>
-              <w:t>40/40 metinli</w:t>
+              <w:t>67/67 geçerli</w:t>
             </w:r>
           </w:p>
         </w:tc>
@@ -9114,7 +9249,7 @@
                 <w:color w:val="172033"/>
                 <w:sz w:val="17"/>
               </w:rPr>
-              <w:t>Boş parça / eksik kaynak yolu</w:t>
+              <w:t>Hit@6 / MRR</w:t>
             </w:r>
           </w:p>
         </w:tc>
@@ -9137,7 +9272,7 @@
                 <w:color w:val="172033"/>
                 <w:sz w:val="17"/>
               </w:rPr>
-              <w:t>0 / 0</w:t>
+              <w:t>100% / 0,8361</w:t>
             </w:r>
           </w:p>
         </w:tc>
@@ -9162,7 +9297,7 @@
                 <w:color w:val="172033"/>
                 <w:sz w:val="17"/>
               </w:rPr>
-              <w:t>Canlı Streamlit</w:t>
+              <w:t>İndekslenen parça</w:t>
             </w:r>
           </w:p>
         </w:tc>
@@ -9185,7 +9320,7 @@
                 <w:color w:val="172033"/>
                 <w:sz w:val="17"/>
               </w:rPr>
-              <w:t>HTTP 200</w:t>
+              <w:t>67</w:t>
             </w:r>
           </w:p>
         </w:tc>
@@ -9210,7 +9345,7 @@
                 <w:color w:val="172033"/>
                 <w:sz w:val="17"/>
               </w:rPr>
-              <w:t>Temiz Git arşivi</w:t>
+              <w:t>PDF sayfası</w:t>
             </w:r>
           </w:p>
         </w:tc>
@@ -9218,6 +9353,150 @@
           <w:tcPr>
             <w:tcW w:type="dxa" w:w="4876"/>
             <w:shd w:fill="F3F6FA"/>
+            <w:tcBorders>
+              <w:top w:val="single" w:sz="6" w:color="D7E0EA"/>
+              <w:left w:val="single" w:sz="6" w:color="D7E0EA"/>
+              <w:bottom w:val="single" w:sz="6" w:color="D7E0EA"/>
+              <w:right w:val="single" w:sz="6" w:color="D7E0EA"/>
+            </w:tcBorders>
+            <w:vAlign w:val="center"/>
+          </w:tcPr>
+          <w:p>
+            <w:r>
+              <w:rPr>
+                <w:rFonts w:ascii="Aptos" w:hAnsi="Aptos"/>
+                <w:color w:val="172033"/>
+                <w:sz w:val="17"/>
+              </w:rPr>
+              <w:t>40/40 metinli</w:t>
+            </w:r>
+          </w:p>
+        </w:tc>
+      </w:tr>
+      <w:tr>
+        <w:tc>
+          <w:tcPr>
+            <w:tcW w:type="dxa" w:w="4535"/>
+            <w:shd w:fill="FFFFFF"/>
+            <w:tcBorders>
+              <w:top w:val="single" w:sz="6" w:color="D7E0EA"/>
+              <w:left w:val="single" w:sz="6" w:color="D7E0EA"/>
+              <w:bottom w:val="single" w:sz="6" w:color="D7E0EA"/>
+              <w:right w:val="single" w:sz="6" w:color="D7E0EA"/>
+            </w:tcBorders>
+            <w:vAlign w:val="center"/>
+          </w:tcPr>
+          <w:p>
+            <w:r>
+              <w:rPr>
+                <w:rFonts w:ascii="Aptos" w:hAnsi="Aptos"/>
+                <w:color w:val="172033"/>
+                <w:sz w:val="17"/>
+              </w:rPr>
+              <w:t>Boş parça / eksik kaynak yolu</w:t>
+            </w:r>
+          </w:p>
+        </w:tc>
+        <w:tc>
+          <w:tcPr>
+            <w:tcW w:type="dxa" w:w="4876"/>
+            <w:shd w:fill="FFFFFF"/>
+            <w:tcBorders>
+              <w:top w:val="single" w:sz="6" w:color="D7E0EA"/>
+              <w:left w:val="single" w:sz="6" w:color="D7E0EA"/>
+              <w:bottom w:val="single" w:sz="6" w:color="D7E0EA"/>
+              <w:right w:val="single" w:sz="6" w:color="D7E0EA"/>
+            </w:tcBorders>
+            <w:vAlign w:val="center"/>
+          </w:tcPr>
+          <w:p>
+            <w:r>
+              <w:rPr>
+                <w:rFonts w:ascii="Aptos" w:hAnsi="Aptos"/>
+                <w:color w:val="172033"/>
+                <w:sz w:val="17"/>
+              </w:rPr>
+              <w:t>0 / 0</w:t>
+            </w:r>
+          </w:p>
+        </w:tc>
+      </w:tr>
+      <w:tr>
+        <w:tc>
+          <w:tcPr>
+            <w:tcW w:type="dxa" w:w="4535"/>
+            <w:shd w:fill="F3F6FA"/>
+            <w:tcBorders>
+              <w:top w:val="single" w:sz="6" w:color="D7E0EA"/>
+              <w:left w:val="single" w:sz="6" w:color="D7E0EA"/>
+              <w:bottom w:val="single" w:sz="6" w:color="D7E0EA"/>
+              <w:right w:val="single" w:sz="6" w:color="D7E0EA"/>
+            </w:tcBorders>
+            <w:vAlign w:val="center"/>
+          </w:tcPr>
+          <w:p>
+            <w:r>
+              <w:rPr>
+                <w:rFonts w:ascii="Aptos" w:hAnsi="Aptos"/>
+                <w:color w:val="172033"/>
+                <w:sz w:val="17"/>
+              </w:rPr>
+              <w:t>Canlı Streamlit</w:t>
+            </w:r>
+          </w:p>
+        </w:tc>
+        <w:tc>
+          <w:tcPr>
+            <w:tcW w:type="dxa" w:w="4876"/>
+            <w:shd w:fill="F3F6FA"/>
+            <w:tcBorders>
+              <w:top w:val="single" w:sz="6" w:color="D7E0EA"/>
+              <w:left w:val="single" w:sz="6" w:color="D7E0EA"/>
+              <w:bottom w:val="single" w:sz="6" w:color="D7E0EA"/>
+              <w:right w:val="single" w:sz="6" w:color="D7E0EA"/>
+            </w:tcBorders>
+            <w:vAlign w:val="center"/>
+          </w:tcPr>
+          <w:p>
+            <w:r>
+              <w:rPr>
+                <w:rFonts w:ascii="Aptos" w:hAnsi="Aptos"/>
+                <w:color w:val="172033"/>
+                <w:sz w:val="17"/>
+              </w:rPr>
+              <w:t>HTTP 200</w:t>
+            </w:r>
+          </w:p>
+        </w:tc>
+      </w:tr>
+      <w:tr>
+        <w:tc>
+          <w:tcPr>
+            <w:tcW w:type="dxa" w:w="4535"/>
+            <w:shd w:fill="FFFFFF"/>
+            <w:tcBorders>
+              <w:top w:val="single" w:sz="6" w:color="D7E0EA"/>
+              <w:left w:val="single" w:sz="6" w:color="D7E0EA"/>
+              <w:bottom w:val="single" w:sz="6" w:color="D7E0EA"/>
+              <w:right w:val="single" w:sz="6" w:color="D7E0EA"/>
+            </w:tcBorders>
+            <w:vAlign w:val="center"/>
+          </w:tcPr>
+          <w:p>
+            <w:r>
+              <w:rPr>
+                <w:rFonts w:ascii="Aptos" w:hAnsi="Aptos"/>
+                <w:color w:val="172033"/>
+                <w:sz w:val="17"/>
+              </w:rPr>
+              <w:t>Temiz Git arşivi</w:t>
+            </w:r>
+          </w:p>
+        </w:tc>
+        <w:tc>
+          <w:tcPr>
+            <w:tcW w:type="dxa" w:w="4876"/>
+            <w:shd w:fill="FFFFFF"/>
             <w:tcBorders>
               <w:top w:val="single" w:sz="6" w:color="D7E0EA"/>
               <w:left w:val="single" w:sz="6" w:color="D7E0EA"/>
@@ -10233,7 +10512,7 @@
     </w:p>
     <w:p>
       <w:r>
-        <w:t>Bu dokümantasyonun referans aldığı doğrulanmış entegrasyon commit'i codex/offline-knowledge-base'dır. Eski main geçmişi silinmemiş; modüler mimari feature dalından develop'a merge commit ile alınmıştır.</w:t>
+        <w:t>Bu dokümantasyonun referans aldığı doğrulanmış entegrasyon commit'i codex/evaluation-benchmark'dır. Eski main geçmişi silinmemiş; modüler mimari feature dalından develop'a merge commit ile alınmıştır.</w:t>
       </w:r>
     </w:p>
     <w:p>
@@ -11269,7 +11548,7 @@
                 <w:color w:val="172033"/>
                 <w:sz w:val="17"/>
               </w:rPr>
-              <w:t>RAG değerlendirme paneli ve kullanıcı geri bildirimi</w:t>
+              <w:t>Kullanıcı geri bildirimi ve kalite eğilim alarmı</w:t>
             </w:r>
           </w:p>
         </w:tc>
@@ -11292,7 +11571,7 @@
                 <w:color w:val="172033"/>
                 <w:sz w:val="17"/>
               </w:rPr>
-              <w:t>Kalite eğilimi ve hata analizi</w:t>
+              <w:t>Hata analizi ve drift görünürlüğü</w:t>
             </w:r>
           </w:p>
         </w:tc>
@@ -11411,7 +11690,7 @@
                 <w:color w:val="172033"/>
                 <w:sz w:val="17"/>
               </w:rPr>
-              <w:t>Kaynak onay iş akışı ve audit entegrasyonu</w:t>
+              <w:t>Merkezi audit aktarımı ve kaynak onay iş akışı</w:t>
             </w:r>
           </w:p>
         </w:tc>
@@ -11550,7 +11829,7 @@
                 <w:color w:val="172033"/>
                 <w:sz w:val="19"/>
               </w:rPr>
-              <w:t>Sunum sonrası ilk mühendislik paketi: OCR + kalıcı indeks + otomatik regression pipeline. Kurumsal yaygınlaştırma öncesinde RBAC, audit ve disk şifreleme eklenmelidir.</w:t>
+              <w:t>Sunum sonrası ilk mühendislik paketi: OCR + kalıcı indeks + otomatik regression pipeline. Yerel gizlilik-korumalı audit tamamlandı; kurumsal yaygınlaştırma öncesinde RBAC, merkezi audit aktarımı ve disk şifreleme eklenmelidir.</w:t>
             </w:r>
           </w:p>
         </w:tc>

</xml_diff>

<commit_message>
feat: add chunk-lineage evaluation and expand knowledge base
</commit_message>
<xml_diff>
--- a/deliverables/CMS-RAG_Nihai_Teknik_Dokumantasyon.docx
+++ b/deliverables/CMS-RAG_Nihai_Teknik_Dokumantasyon.docx
@@ -160,7 +160,7 @@
                 <w:color w:val="172033"/>
                 <w:sz w:val="17"/>
               </w:rPr>
-              <w:t>1.2</w:t>
+              <w:t>1.3</w:t>
             </w:r>
           </w:p>
         </w:tc>
@@ -208,7 +208,7 @@
                 <w:color w:val="172033"/>
                 <w:sz w:val="17"/>
               </w:rPr>
-              <w:t>02.08.2026</w:t>
+              <w:t>06.08.2026</w:t>
             </w:r>
           </w:p>
         </w:tc>
@@ -352,7 +352,7 @@
                 <w:color w:val="172033"/>
                 <w:sz w:val="17"/>
               </w:rPr>
-              <w:t>Nihai kabul — 41/41 test, 8/8 retrieval, 7/7 yanıt</w:t>
+              <w:t>Nihai kabul — 82/82 test, 8/8 retrieval, 7/7 yanıt</w:t>
             </w:r>
           </w:p>
         </w:tc>
@@ -786,7 +786,7 @@
                 <w:color w:val="172033"/>
                 <w:sz w:val="17"/>
               </w:rPr>
-              <w:t>41/41 test, 8/8 retrieval, 7/7 yanıt ve 67/67 snapshot</w:t>
+              <w:t>82/82 test, 8/8 retrieval, 7/7 yanıt ve 77/77 snapshot</w:t>
             </w:r>
           </w:p>
         </w:tc>
@@ -960,7 +960,7 @@
     </w:p>
     <w:p>
       <w:r>
-        <w:t>Araştırma ve kaynak toplama normal kullanımdan önce tamamlanır. Dört metin çıkarılabilir PDF, 67 anlamlı parça ve bunların önceden hesaplanmış embeddingleri sürümlenmiş bir snapshot olarak hazırlanır. Streamlit açıldığında bu hazır paket yüklenir; çalışma anında web taraması veya çekirdek belgeleri yeniden embedding etme işlemi yapılmaz. Yerel Ollama yalnız getirilen kanıt üzerinden cevap üretir.</w:t>
+        <w:t>Araştırma ve kaynak toplama normal kullanımdan önce tamamlanır. Dört metin çıkarılabilir PDF, 77 anlamlı parça ve bunların önceden hesaplanmış embeddingleri sürümlenmiş bir snapshot olarak hazırlanır. Streamlit açıldığında bu hazır paket yüklenir; çalışma anında web taraması veya çekirdek belgeleri yeniden embedding etme işlemi yapılmaz. Yerel Ollama yalnız getirilen kanıt üzerinden cevap üretir.</w:t>
       </w:r>
     </w:p>
     <w:tbl>
@@ -1318,7 +1318,7 @@
                 <w:color w:val="172033"/>
                 <w:sz w:val="17"/>
               </w:rPr>
-              <w:t>67</w:t>
+              <w:t>77</w:t>
             </w:r>
           </w:p>
         </w:tc>
@@ -1341,7 +1341,7 @@
                 <w:color w:val="172033"/>
                 <w:sz w:val="17"/>
               </w:rPr>
-              <w:t>Dört PDF ve önceden hesaplanmış 67 embedding</w:t>
+              <w:t>Beş PDF ve önceden hesaplanmış 77 embedding</w:t>
             </w:r>
           </w:p>
         </w:tc>
@@ -1389,7 +1389,7 @@
                 <w:color w:val="172033"/>
                 <w:sz w:val="17"/>
               </w:rPr>
-              <w:t>40 / 40 sayfa</w:t>
+              <w:t>42 / 42 sayfa</w:t>
             </w:r>
           </w:p>
         </w:tc>
@@ -1412,7 +1412,7 @@
                 <w:color w:val="172033"/>
                 <w:sz w:val="17"/>
               </w:rPr>
-              <w:t>44.398 çıkarılmış metin karakteri</w:t>
+              <w:t>50.802 çıkarılmış metin karakteri</w:t>
             </w:r>
           </w:p>
         </w:tc>
@@ -2219,7 +2219,7 @@
                 <w:color w:val="172033"/>
                 <w:sz w:val="17"/>
               </w:rPr>
-              <w:t>41/41, 8/8, 7/7 ve 67/67</w:t>
+              <w:t>82/82, 8/8, 7/7 ve 77/77</w:t>
             </w:r>
           </w:p>
         </w:tc>
@@ -9032,7 +9032,7 @@
                 <w:color w:val="172033"/>
                 <w:sz w:val="17"/>
               </w:rPr>
-              <w:t>69/69</w:t>
+              <w:t>82/82</w:t>
             </w:r>
           </w:p>
         </w:tc>
@@ -9224,7 +9224,7 @@
                 <w:color w:val="172033"/>
                 <w:sz w:val="17"/>
               </w:rPr>
-              <w:t>67/67 geçerli</w:t>
+              <w:t>77/77 geçerli</w:t>
             </w:r>
           </w:p>
         </w:tc>
@@ -9249,7 +9249,7 @@
                 <w:color w:val="172033"/>
                 <w:sz w:val="17"/>
               </w:rPr>
-              <w:t>Hit@6 / MRR</w:t>
+              <w:t>20-vaka TP / TN / FP / FN</w:t>
             </w:r>
           </w:p>
         </w:tc>
@@ -9272,7 +9272,7 @@
                 <w:color w:val="172033"/>
                 <w:sz w:val="17"/>
               </w:rPr>
-              <w:t>100% / 0,8361</w:t>
+              <w:t>15 / 4 / 0 / 1</w:t>
             </w:r>
           </w:p>
         </w:tc>
@@ -9297,7 +9297,7 @@
                 <w:color w:val="172033"/>
                 <w:sz w:val="17"/>
               </w:rPr>
-              <w:t>İndekslenen parça</w:t>
+              <w:t>20-vaka accuracy / F1</w:t>
             </w:r>
           </w:p>
         </w:tc>
@@ -9320,7 +9320,7 @@
                 <w:color w:val="172033"/>
                 <w:sz w:val="17"/>
               </w:rPr>
-              <w:t>67</w:t>
+              <w:t>95.0% / 96.77%</w:t>
             </w:r>
           </w:p>
         </w:tc>
@@ -9345,7 +9345,7 @@
                 <w:color w:val="172033"/>
                 <w:sz w:val="17"/>
               </w:rPr>
-              <w:t>PDF sayfası</w:t>
+              <w:t>Exact chunk-köken başarı</w:t>
             </w:r>
           </w:p>
         </w:tc>
@@ -9368,7 +9368,7 @@
                 <w:color w:val="172033"/>
                 <w:sz w:val="17"/>
               </w:rPr>
-              <w:t>40/40 metinli</w:t>
+              <w:t>13/16</w:t>
             </w:r>
           </w:p>
         </w:tc>
@@ -9393,7 +9393,7 @@
                 <w:color w:val="172033"/>
                 <w:sz w:val="17"/>
               </w:rPr>
-              <w:t>Boş parça / eksik kaynak yolu</w:t>
+              <w:t>Hit@6 / MRR</w:t>
             </w:r>
           </w:p>
         </w:tc>
@@ -9416,7 +9416,7 @@
                 <w:color w:val="172033"/>
                 <w:sz w:val="17"/>
               </w:rPr>
-              <w:t>0 / 0</w:t>
+              <w:t>100% / 0,7694</w:t>
             </w:r>
           </w:p>
         </w:tc>
@@ -9441,7 +9441,7 @@
                 <w:color w:val="172033"/>
                 <w:sz w:val="17"/>
               </w:rPr>
-              <w:t>Canlı Streamlit</w:t>
+              <w:t>İndekslenen parça</w:t>
             </w:r>
           </w:p>
         </w:tc>
@@ -9464,7 +9464,7 @@
                 <w:color w:val="172033"/>
                 <w:sz w:val="17"/>
               </w:rPr>
-              <w:t>HTTP 200</w:t>
+              <w:t>77</w:t>
             </w:r>
           </w:p>
         </w:tc>
@@ -9489,7 +9489,7 @@
                 <w:color w:val="172033"/>
                 <w:sz w:val="17"/>
               </w:rPr>
-              <w:t>Temiz Git arşivi</w:t>
+              <w:t>PDF sayfası</w:t>
             </w:r>
           </w:p>
         </w:tc>
@@ -9497,6 +9497,150 @@
           <w:tcPr>
             <w:tcW w:type="dxa" w:w="4876"/>
             <w:shd w:fill="FFFFFF"/>
+            <w:tcBorders>
+              <w:top w:val="single" w:sz="6" w:color="D7E0EA"/>
+              <w:left w:val="single" w:sz="6" w:color="D7E0EA"/>
+              <w:bottom w:val="single" w:sz="6" w:color="D7E0EA"/>
+              <w:right w:val="single" w:sz="6" w:color="D7E0EA"/>
+            </w:tcBorders>
+            <w:vAlign w:val="center"/>
+          </w:tcPr>
+          <w:p>
+            <w:r>
+              <w:rPr>
+                <w:rFonts w:ascii="Aptos" w:hAnsi="Aptos"/>
+                <w:color w:val="172033"/>
+                <w:sz w:val="17"/>
+              </w:rPr>
+              <w:t>42/42 metinli</w:t>
+            </w:r>
+          </w:p>
+        </w:tc>
+      </w:tr>
+      <w:tr>
+        <w:tc>
+          <w:tcPr>
+            <w:tcW w:type="dxa" w:w="4535"/>
+            <w:shd w:fill="F3F6FA"/>
+            <w:tcBorders>
+              <w:top w:val="single" w:sz="6" w:color="D7E0EA"/>
+              <w:left w:val="single" w:sz="6" w:color="D7E0EA"/>
+              <w:bottom w:val="single" w:sz="6" w:color="D7E0EA"/>
+              <w:right w:val="single" w:sz="6" w:color="D7E0EA"/>
+            </w:tcBorders>
+            <w:vAlign w:val="center"/>
+          </w:tcPr>
+          <w:p>
+            <w:r>
+              <w:rPr>
+                <w:rFonts w:ascii="Aptos" w:hAnsi="Aptos"/>
+                <w:color w:val="172033"/>
+                <w:sz w:val="17"/>
+              </w:rPr>
+              <w:t>Boş parça / eksik kaynak yolu</w:t>
+            </w:r>
+          </w:p>
+        </w:tc>
+        <w:tc>
+          <w:tcPr>
+            <w:tcW w:type="dxa" w:w="4876"/>
+            <w:shd w:fill="F3F6FA"/>
+            <w:tcBorders>
+              <w:top w:val="single" w:sz="6" w:color="D7E0EA"/>
+              <w:left w:val="single" w:sz="6" w:color="D7E0EA"/>
+              <w:bottom w:val="single" w:sz="6" w:color="D7E0EA"/>
+              <w:right w:val="single" w:sz="6" w:color="D7E0EA"/>
+            </w:tcBorders>
+            <w:vAlign w:val="center"/>
+          </w:tcPr>
+          <w:p>
+            <w:r>
+              <w:rPr>
+                <w:rFonts w:ascii="Aptos" w:hAnsi="Aptos"/>
+                <w:color w:val="172033"/>
+                <w:sz w:val="17"/>
+              </w:rPr>
+              <w:t>0 / 0</w:t>
+            </w:r>
+          </w:p>
+        </w:tc>
+      </w:tr>
+      <w:tr>
+        <w:tc>
+          <w:tcPr>
+            <w:tcW w:type="dxa" w:w="4535"/>
+            <w:shd w:fill="FFFFFF"/>
+            <w:tcBorders>
+              <w:top w:val="single" w:sz="6" w:color="D7E0EA"/>
+              <w:left w:val="single" w:sz="6" w:color="D7E0EA"/>
+              <w:bottom w:val="single" w:sz="6" w:color="D7E0EA"/>
+              <w:right w:val="single" w:sz="6" w:color="D7E0EA"/>
+            </w:tcBorders>
+            <w:vAlign w:val="center"/>
+          </w:tcPr>
+          <w:p>
+            <w:r>
+              <w:rPr>
+                <w:rFonts w:ascii="Aptos" w:hAnsi="Aptos"/>
+                <w:color w:val="172033"/>
+                <w:sz w:val="17"/>
+              </w:rPr>
+              <w:t>Canlı Streamlit</w:t>
+            </w:r>
+          </w:p>
+        </w:tc>
+        <w:tc>
+          <w:tcPr>
+            <w:tcW w:type="dxa" w:w="4876"/>
+            <w:shd w:fill="FFFFFF"/>
+            <w:tcBorders>
+              <w:top w:val="single" w:sz="6" w:color="D7E0EA"/>
+              <w:left w:val="single" w:sz="6" w:color="D7E0EA"/>
+              <w:bottom w:val="single" w:sz="6" w:color="D7E0EA"/>
+              <w:right w:val="single" w:sz="6" w:color="D7E0EA"/>
+            </w:tcBorders>
+            <w:vAlign w:val="center"/>
+          </w:tcPr>
+          <w:p>
+            <w:r>
+              <w:rPr>
+                <w:rFonts w:ascii="Aptos" w:hAnsi="Aptos"/>
+                <w:color w:val="172033"/>
+                <w:sz w:val="17"/>
+              </w:rPr>
+              <w:t>HTTP 200</w:t>
+            </w:r>
+          </w:p>
+        </w:tc>
+      </w:tr>
+      <w:tr>
+        <w:tc>
+          <w:tcPr>
+            <w:tcW w:type="dxa" w:w="4535"/>
+            <w:shd w:fill="F3F6FA"/>
+            <w:tcBorders>
+              <w:top w:val="single" w:sz="6" w:color="D7E0EA"/>
+              <w:left w:val="single" w:sz="6" w:color="D7E0EA"/>
+              <w:bottom w:val="single" w:sz="6" w:color="D7E0EA"/>
+              <w:right w:val="single" w:sz="6" w:color="D7E0EA"/>
+            </w:tcBorders>
+            <w:vAlign w:val="center"/>
+          </w:tcPr>
+          <w:p>
+            <w:r>
+              <w:rPr>
+                <w:rFonts w:ascii="Aptos" w:hAnsi="Aptos"/>
+                <w:color w:val="172033"/>
+                <w:sz w:val="17"/>
+              </w:rPr>
+              <w:t>Temiz Git arşivi</w:t>
+            </w:r>
+          </w:p>
+        </w:tc>
+        <w:tc>
+          <w:tcPr>
+            <w:tcW w:type="dxa" w:w="4876"/>
+            <w:shd w:fill="F3F6FA"/>
             <w:tcBorders>
               <w:top w:val="single" w:sz="6" w:color="D7E0EA"/>
               <w:left w:val="single" w:sz="6" w:color="D7E0EA"/>
@@ -12372,7 +12516,7 @@
                 <w:color w:val="172033"/>
                 <w:sz w:val="17"/>
               </w:rPr>
-              <w:t>41/41, 8/8, 7/7 ve 67/67 snapshot</w:t>
+              <w:t>82/82, 8/8, 7/7 ve 77/77 snapshot</w:t>
             </w:r>
           </w:p>
         </w:tc>

</xml_diff>

<commit_message>
feat: finalize agentic workflow and durable conversations
</commit_message>
<xml_diff>
--- a/deliverables/CMS-RAG_Nihai_Teknik_Dokumantasyon.docx
+++ b/deliverables/CMS-RAG_Nihai_Teknik_Dokumantasyon.docx
@@ -160,7 +160,7 @@
                 <w:color w:val="172033"/>
                 <w:sz w:val="17"/>
               </w:rPr>
-              <w:t>1.3</w:t>
+              <w:t>2.0</w:t>
             </w:r>
           </w:p>
         </w:tc>
@@ -208,7 +208,7 @@
                 <w:color w:val="172033"/>
                 <w:sz w:val="17"/>
               </w:rPr>
-              <w:t>06.08.2026</w:t>
+              <w:t>18.08.2026</w:t>
             </w:r>
           </w:p>
         </w:tc>
@@ -256,7 +256,7 @@
                 <w:color w:val="172033"/>
                 <w:sz w:val="17"/>
               </w:rPr>
-              <w:t>codex/evaluation-benchmark</w:t>
+              <w:t>codex/pgvector-lineage · agentic final</w:t>
             </w:r>
           </w:p>
         </w:tc>
@@ -352,7 +352,7 @@
                 <w:color w:val="172033"/>
                 <w:sz w:val="17"/>
               </w:rPr>
-              <w:t>Nihai kabul — 82/82 test, 8/8 retrieval, 7/7 yanıt</w:t>
+              <w:t>Nihai kabul — 137/137 test, 8/8 retrieval, 7/7 yanıt</w:t>
             </w:r>
           </w:p>
         </w:tc>
@@ -786,7 +786,7 @@
                 <w:color w:val="172033"/>
                 <w:sz w:val="17"/>
               </w:rPr>
-              <w:t>82/82 test, 8/8 retrieval, 7/7 yanıt ve 77/77 snapshot</w:t>
+              <w:t>137/137 test, 8/8 retrieval, 7/7 yanıt ve 77/77 snapshot</w:t>
             </w:r>
           </w:p>
         </w:tc>
@@ -1105,7 +1105,7 @@
                 <w:color w:val="172033"/>
                 <w:sz w:val="17"/>
               </w:rPr>
-              <w:t>41 / 41</w:t>
+              <w:t>137 / 137</w:t>
             </w:r>
           </w:p>
         </w:tc>
@@ -1128,7 +1128,7 @@
                 <w:color w:val="172033"/>
                 <w:sz w:val="17"/>
               </w:rPr>
-              <w:t>Birim, entegrasyon, UI ve mimari sınır testleri</w:t>
+              <w:t>Birim, entegrasyon, UI, agentic ve mimari sınır testleri</w:t>
             </w:r>
           </w:p>
         </w:tc>
@@ -2219,7 +2219,7 @@
                 <w:color w:val="172033"/>
                 <w:sz w:val="17"/>
               </w:rPr>
-              <w:t>82/82, 8/8, 7/7 ve 77/77</w:t>
+              <w:t>137/137, 8/8, 7/7 ve 77/77</w:t>
             </w:r>
           </w:p>
         </w:tc>
@@ -4121,6 +4121,24 @@
     </w:tbl>
     <w:p/>
     <w:p>
+      <w:pPr>
+        <w:pStyle w:val="Heading2"/>
+      </w:pPr>
+      <w:r>
+        <w:t>5.2 Agentic LangGraph ve kalıcı konuşmalar</w:t>
+      </w:r>
+    </w:p>
+    <w:p>
+      <w:r>
+        <w:t>Agentic mod; bilgi, MCP kontrol ve güvenli ret rotalarını ayrı checkpoint'li düğümlerle yönetir. Bilgi akışında sorgu planlama, hibrit retrieval, kanıt kapısı, yerel üretim, atıf doğrulama ve en fazla bir deterministik onarım bulunur. PostgreSQL checkpointer kullanıldığında konuşmalar yeniden başlatma sonrasında listelenip kaynak kartlarıyla geri yüklenebilir.</w:t>
+      </w:r>
+    </w:p>
+    <w:p>
+      <w:r>
+        <w:t>MCP yazma komutu interrupt noktasında durur. Operatör onayı olmadan set aracı çağrılmaz; onay veya ret aynı thread üzerinde resume edilerek kalıcı sonuca dönüşür. Bekleyen onay uygulama yeniden başlatılsa bile bulunabilir. Planlama veya model arızası traceback yerine belgesiz üretim yapmayan güvenli sonuçla kapanır.</w:t>
+      </w:r>
+    </w:p>
+    <w:p>
       <w:r>
         <w:br w:type="page"/>
       </w:r>
@@ -8819,7 +8837,7 @@
                 <w:color w:val="172033"/>
                 <w:sz w:val="17"/>
               </w:rPr>
-              <w:t>Retrieval</w:t>
+              <w:t>Agentic</w:t>
             </w:r>
           </w:p>
         </w:tc>
@@ -8842,7 +8860,7 @@
                 <w:color w:val="172033"/>
                 <w:sz w:val="17"/>
               </w:rPr>
-              <w:t>45 altın belge/terim/sayfa ve güvenli-ret vakası</w:t>
+              <w:t>Route, checkpoint, konuşma geri yükleme, interrupt/resume ve hata sınırları</w:t>
             </w:r>
           </w:p>
         </w:tc>
@@ -8850,6 +8868,77 @@
           <w:tcPr>
             <w:tcW w:type="dxa" w:w="1644"/>
             <w:shd w:fill="FFFFFF"/>
+            <w:tcBorders>
+              <w:top w:val="single" w:sz="6" w:color="D7E0EA"/>
+              <w:left w:val="single" w:sz="6" w:color="D7E0EA"/>
+              <w:bottom w:val="single" w:sz="6" w:color="D7E0EA"/>
+              <w:right w:val="single" w:sz="6" w:color="D7E0EA"/>
+            </w:tcBorders>
+            <w:vAlign w:val="center"/>
+          </w:tcPr>
+          <w:p>
+            <w:r>
+              <w:rPr>
+                <w:rFonts w:ascii="Aptos" w:hAnsi="Aptos"/>
+                <w:color w:val="172033"/>
+                <w:sz w:val="17"/>
+              </w:rPr>
+              <w:t>Başarılı</w:t>
+            </w:r>
+          </w:p>
+        </w:tc>
+      </w:tr>
+      <w:tr>
+        <w:tc>
+          <w:tcPr>
+            <w:tcW w:type="dxa" w:w="2268"/>
+            <w:shd w:fill="F3F6FA"/>
+            <w:tcBorders>
+              <w:top w:val="single" w:sz="6" w:color="D7E0EA"/>
+              <w:left w:val="single" w:sz="6" w:color="D7E0EA"/>
+              <w:bottom w:val="single" w:sz="6" w:color="D7E0EA"/>
+              <w:right w:val="single" w:sz="6" w:color="D7E0EA"/>
+            </w:tcBorders>
+            <w:vAlign w:val="center"/>
+          </w:tcPr>
+          <w:p>
+            <w:r>
+              <w:rPr>
+                <w:rFonts w:ascii="Aptos" w:hAnsi="Aptos"/>
+                <w:color w:val="172033"/>
+                <w:sz w:val="17"/>
+              </w:rPr>
+              <w:t>Retrieval</w:t>
+            </w:r>
+          </w:p>
+        </w:tc>
+        <w:tc>
+          <w:tcPr>
+            <w:tcW w:type="dxa" w:w="5499"/>
+            <w:shd w:fill="F3F6FA"/>
+            <w:tcBorders>
+              <w:top w:val="single" w:sz="6" w:color="D7E0EA"/>
+              <w:left w:val="single" w:sz="6" w:color="D7E0EA"/>
+              <w:bottom w:val="single" w:sz="6" w:color="D7E0EA"/>
+              <w:right w:val="single" w:sz="6" w:color="D7E0EA"/>
+            </w:tcBorders>
+            <w:vAlign w:val="center"/>
+          </w:tcPr>
+          <w:p>
+            <w:r>
+              <w:rPr>
+                <w:rFonts w:ascii="Aptos" w:hAnsi="Aptos"/>
+                <w:color w:val="172033"/>
+                <w:sz w:val="17"/>
+              </w:rPr>
+              <w:t>45 altın belge/terim/sayfa ve güvenli-ret vakası</w:t>
+            </w:r>
+          </w:p>
+        </w:tc>
+        <w:tc>
+          <w:tcPr>
+            <w:tcW w:type="dxa" w:w="1644"/>
+            <w:shd w:fill="F3F6FA"/>
             <w:tcBorders>
               <w:top w:val="single" w:sz="6" w:color="D7E0EA"/>
               <w:left w:val="single" w:sz="6" w:color="D7E0EA"/>
@@ -9032,7 +9121,7 @@
                 <w:color w:val="172033"/>
                 <w:sz w:val="17"/>
               </w:rPr>
-              <w:t>82/82</w:t>
+              <w:t>137/137</w:t>
             </w:r>
           </w:p>
         </w:tc>
@@ -10656,7 +10745,7 @@
     </w:p>
     <w:p>
       <w:r>
-        <w:t>Bu dokümantasyonun referans aldığı doğrulanmış entegrasyon commit'i codex/evaluation-benchmark'dır. Eski main geçmişi silinmemiş; modüler mimari feature dalından develop'a merge commit ile alınmıştır.</w:t>
+        <w:t>Bu dokümantasyonun referans aldığı doğrulanmış entegrasyon commit'i codex/pgvector-lineage · agentic final'dır. Eski main geçmişi silinmemiş; modüler mimari feature dalından develop'a merge commit ile alınmıştır.</w:t>
       </w:r>
     </w:p>
     <w:p>
@@ -12516,7 +12605,7 @@
                 <w:color w:val="172033"/>
                 <w:sz w:val="17"/>
               </w:rPr>
-              <w:t>82/82, 8/8, 7/7 ve 77/77 snapshot</w:t>
+              <w:t>137/137, 8/8, 7/7 ve 77/77 snapshot</w:t>
             </w:r>
           </w:p>
         </w:tc>

</xml_diff>